<commit_message>
Omer site: signature images and permit-holder type checkboxes
- Upload a signature image for the permit holder, the skeleton
  engineer and the registered contractor. The background is made
  transparent and cropped, and the image is placed on the
  "חתימה:" line of every form that person signs.
- Saved team members keep their signature.
- Choose the permit-holder type (אדם פרטי / תאגיד / גוף 261 ד');
  the matching box is checked (☒) in every official form.
- Local forms 4.1/5.1/6.1 and פרטי התקשרות: signature line tagged,
  4.1 also gets the signer's name.

Co-Authored-By: Claude Opus 5.5 <noreply@anthropic.com>
Claude-Session: https://claude.ai/code/session_019Pu9ZLQsPUssQSQjiBuQdX
</commit_message>
<xml_diff>
--- a/omer/templates/4.1.docx
+++ b/omer/templates/4.1.docx
@@ -823,7 +823,15 @@
           <w:rtl/>
         </w:rPr>
         <w:tab/>
-        <w:t>________________</w:t>
+        <w:t xml:space="preserve"/>
+      </w:r>
+      <w:r>
+        <w:rPr>
+          <w:rFonts w:ascii="Calibri" w:eastAsia="Calibri" w:hAnsi="Calibri"/>
+          <w:sz w:val="24"/>
+          <w:rtl/>
+        </w:rPr>
+        <w:t xml:space="preserve">{{signerName|________________}}</w:t>
       </w:r>
       <w:r>
         <w:rPr>
@@ -983,7 +991,15 @@
           <w:rtl/>
         </w:rPr>
         <w:tab/>
-        <w:t>________________</w:t>
+        <w:t xml:space="preserve"/>
+      </w:r>
+      <w:r>
+        <w:rPr>
+          <w:rFonts w:ascii="Calibri" w:eastAsia="Calibri" w:hAnsi="Calibri"/>
+          <w:sz w:val="24"/>
+          <w:rtl/>
+        </w:rPr>
+        <w:t xml:space="preserve">{{signature|________________}}</w:t>
       </w:r>
       <w:r>
         <w:rPr>

</xml_diff>